<commit_message>
docs: refine word pagination
</commit_message>
<xml_diff>
--- a/COURSE_PAPER_FORMATTED.docx
+++ b/COURSE_PAPER_FORMATTED.docx
@@ -599,7 +599,7 @@
           <w:rFonts w:ascii="Times New Roman" w:hAnsi="Times New Roman" w:cs="Times New Roman" w:eastAsia="宋体"/>
           <w:sz w:val="24"/>
         </w:rPr>
-        <w:t>2</w:t>
+        <w:t>3</w:t>
       </w:r>
     </w:p>
     <w:p>
@@ -625,7 +625,7 @@
           <w:rFonts w:ascii="Times New Roman" w:hAnsi="Times New Roman" w:cs="Times New Roman" w:eastAsia="宋体"/>
           <w:sz w:val="24"/>
         </w:rPr>
-        <w:t>4</w:t>
+        <w:t>5</w:t>
       </w:r>
     </w:p>
     <w:p>
@@ -703,7 +703,7 @@
           <w:rFonts w:ascii="Times New Roman" w:hAnsi="Times New Roman" w:cs="Times New Roman" w:eastAsia="宋体"/>
           <w:sz w:val="24"/>
         </w:rPr>
-        <w:t>16</w:t>
+        <w:t>17</w:t>
       </w:r>
     </w:p>
     <w:p>
@@ -842,21 +842,20 @@
     </w:p>
     <w:p>
       <w:pPr>
-        <w:spacing w:line="360" w:lineRule="auto" w:before="0" w:after="0"/>
-        <w:ind w:firstLine="480"/>
-        <w:jc w:val="both"/>
-      </w:pPr>
-      <w:r>
-        <w:rPr>
-          <w:rFonts w:ascii="Times New Roman" w:hAnsi="Times New Roman" w:cs="Times New Roman" w:eastAsia="宋体"/>
-          <w:sz w:val="24"/>
+        <w:spacing w:line="300" w:lineRule="auto" w:before="0" w:after="0"/>
+        <w:jc w:val="both"/>
+      </w:pPr>
+      <w:r>
+        <w:rPr>
+          <w:rFonts w:ascii="Times New Roman" w:hAnsi="Times New Roman" w:cs="Times New Roman" w:eastAsia="宋体"/>
+          <w:sz w:val="23"/>
         </w:rPr>
         <w:t>子痫前期是妊娠期重要并发症之一，早期识别和风险分层对降低母婴不良结局具有重要意义。传统评估主要依赖血压、蛋白尿、临床症状及常规实验室指标，但在疾病早期、症状不典型或合并其他疾病时，单纯临床判断可能存在延迟和不确定性。可溶性 fms 样酪氨酸激酶-1（soluble fms-like tyrosine kinase-1，sFlt-1）与胎盘生长因子（placental growth factor，PlGF）分别反映抗血管生成和促血管生成状态，其比值能够在一定程度上反映子痫前期相关的血管生成失衡。本文围绕 sFlt-1/PlGF 比值在子痫前期早期预测中的临床检验应用，检索 PubMed、NICE 指南、ISSHP 指南及中文数据库线索，重点纳入指南、系统综述、Meta 分析、多中心前瞻性研究和中文临床研究。现有证据显示，sFlt-1/PlGF 比值在疑似子痫前期孕妇中具有较高的短期排除价值，PROGNOSIS 研究中比值 ≤38 对 1 周内无子痫前期的阴性预测值达 99.3%；2025 年系统综述与 Meta 分析显示，sFlt-1/PlGF 比值预测子痫前期的 AUC 为 0.92，高于单项 sFlt-1 或 PlGF。该指标的应用仍受孕周、检测平台、截断值、人群差异和临床路径影响，不能替代完整临床评估。医学检验人员应重视样本质量、平台差异、室内质控、报告解释和临床沟通，使该比值更好服务于子痫前期的早期预测、短期排除和风险分层。</w:t>
       </w:r>
     </w:p>
     <w:p>
       <w:pPr>
-        <w:spacing w:before="80" w:after="160" w:line="312" w:lineRule="auto"/>
+        <w:spacing w:before="80" w:after="160" w:line="300" w:lineRule="auto"/>
       </w:pPr>
       <w:r>
         <w:rPr>
@@ -869,9 +868,17 @@
       <w:r>
         <w:rPr>
           <w:rFonts w:ascii="Times New Roman" w:hAnsi="Times New Roman" w:cs="Times New Roman" w:eastAsia="宋体"/>
-          <w:sz w:val="24"/>
+          <w:sz w:val="23"/>
         </w:rPr>
         <w:t>子痫前期；sFlt-1；PlGF；sFlt-1/PlGF 比值；早期预测；临床检验</w:t>
+      </w:r>
+    </w:p>
+    <w:p>
+      <w:pPr>
+        <w:spacing w:before="0" w:after="0"/>
+      </w:pPr>
+      <w:r>
+        <w:br w:type="page"/>
       </w:r>
     </w:p>
     <w:p>
@@ -892,21 +899,20 @@
     </w:p>
     <w:p>
       <w:pPr>
-        <w:spacing w:line="360" w:lineRule="auto" w:before="0" w:after="0"/>
-        <w:ind w:firstLine="480"/>
-        <w:jc w:val="both"/>
-      </w:pPr>
-      <w:r>
-        <w:rPr>
-          <w:rFonts w:ascii="Times New Roman" w:hAnsi="Times New Roman" w:cs="Times New Roman" w:eastAsia="宋体"/>
-          <w:sz w:val="24"/>
+        <w:spacing w:line="300" w:lineRule="auto" w:before="0" w:after="0"/>
+        <w:jc w:val="both"/>
+      </w:pPr>
+      <w:r>
+        <w:rPr>
+          <w:rFonts w:ascii="Times New Roman" w:hAnsi="Times New Roman" w:cs="Times New Roman" w:eastAsia="宋体"/>
+          <w:sz w:val="23"/>
         </w:rPr>
         <w:t>Preeclampsia is an important pregnancy complication, and early prediction and risk stratification are essential for reducing adverse maternal and perinatal outcomes. Conventional assessment mainly depends on blood pressure, proteinuria, clinical symptoms and routine laboratory tests, but uncertainty may remain in early or atypical cases. Soluble fms-like tyrosine kinase-1 (sFlt-1) and placental growth factor (PlGF) reflect anti-angiogenic and pro-angiogenic status, respectively, and the sFlt-1/PlGF ratio may indicate angiogenic imbalance related to preeclampsia. This review focuses on the clinical laboratory application of the sFlt-1/PlGF ratio in early prediction of preeclampsia. PubMed, NICE guidance, ISSHP guidelines and Chinese literature sources were searched, with emphasis on guidelines, systematic reviews, meta-analyses, prospective studies and clinical studies. Current evidence suggests that the sFlt-1/PlGF ratio is particularly useful for short-term rule-out in women with suspected preeclampsia. In the PROGNOSIS study, a ratio of 38 or lower had a negative predictive value of 99.3% for ruling out preeclampsia within one week. A 2025 systematic review and meta-analysis reported an AUC of 0.92 for the sFlt-1/PlGF ratio, higher than that of sFlt-1 or PlGF alone. However, interpretation is affected by gestational age, assay platform, cut-off values and population differences. The ratio should therefore be used as an adjunct to clinical assessment, with careful attention to quality control and result interpretation.</w:t>
       </w:r>
     </w:p>
     <w:p>
       <w:pPr>
-        <w:spacing w:before="80" w:after="160" w:line="312" w:lineRule="auto"/>
+        <w:spacing w:before="80" w:after="160" w:line="300" w:lineRule="auto"/>
       </w:pPr>
       <w:r>
         <w:rPr>
@@ -919,9 +925,17 @@
       <w:r>
         <w:rPr>
           <w:rFonts w:ascii="Times New Roman" w:hAnsi="Times New Roman" w:cs="Times New Roman" w:eastAsia="宋体"/>
-          <w:sz w:val="24"/>
+          <w:sz w:val="23"/>
         </w:rPr>
         <w:t xml:space="preserve"> preeclampsia; sFlt-1; PlGF; sFlt-1/PlGF ratio; early prediction; clinical laboratory</w:t>
+      </w:r>
+    </w:p>
+    <w:p>
+      <w:pPr>
+        <w:spacing w:before="0" w:after="0"/>
+      </w:pPr>
+      <w:r>
+        <w:br w:type="page"/>
       </w:r>
     </w:p>
     <w:p>
@@ -994,6 +1008,14 @@
           <w:sz w:val="24"/>
         </w:rPr>
         <w:t>从医学检验技术专业角度看，sFlt-1/PlGF 比值的价值并不只是“多一个检测项目”。其真正意义在于将胎盘血管生成失衡这一病理过程转化为可测量、可报告、可解释并可与临床路径衔接的检验结果。检验人员需要关注样本类型、检测平台、质量控制、截断值适用范围、报告备注以及与产科医生的沟通方式。若忽视孕周、人群、平台和临床背景差异，单一数值可能被误读，甚至导致过度诊断或过度干预。因此，本文拟围绕 sFlt-1/PlGF 比值在子痫前期早期预测中的应用证据、方法学特点、临床解释和局限性进行综述，以期为医学检验人员理解和应用该指标提供参考。</w:t>
+      </w:r>
+    </w:p>
+    <w:p>
+      <w:pPr>
+        <w:spacing w:before="0" w:after="0"/>
+      </w:pPr>
+      <w:r>
+        <w:br w:type="page"/>
       </w:r>
     </w:p>
     <w:p>

</xml_diff>